<commit_message>
cập nhập tài liệu
</commit_message>
<xml_diff>
--- a/vmware/Hướng dẫn cài đặt Free Radius tích hợp AD triển khai hệ thống xác thực 2 lớp cho dịch vụ Vmware UAG.docx
+++ b/vmware/Hướng dẫn cài đặt Free Radius tích hợp AD triển khai hệ thống xác thực 2 lớp cho dịch vụ Vmware UAG.docx
@@ -20,7 +20,7 @@
       <w:hyperlink r:id="rId5" w:history="1">
         <w:r>
           <w:rPr>
-            <w:rStyle w:val="Siuktni"/>
+            <w:rStyle w:val="Hyperlink"/>
           </w:rPr>
           <w:t>https://rockylinux.org/download</w:t>
         </w:r>
@@ -44,6 +44,9 @@
     </w:p>
     <w:p>
       <w:r>
+        <w:rPr>
+          <w:noProof/>
+        </w:rPr>
         <w:drawing>
           <wp:inline distT="0" distB="0" distL="0" distR="0" wp14:anchorId="159393CF" wp14:editId="599A37F3">
             <wp:extent cx="3762900" cy="5410955"/>
@@ -89,6 +92,9 @@
     </w:p>
     <w:p>
       <w:r>
+        <w:rPr>
+          <w:noProof/>
+        </w:rPr>
         <w:drawing>
           <wp:inline distT="0" distB="0" distL="0" distR="0" wp14:anchorId="3DFC763F" wp14:editId="0EC0EEE5">
             <wp:extent cx="5579745" cy="2505075"/>
@@ -134,6 +140,9 @@
     </w:p>
     <w:p>
       <w:r>
+        <w:rPr>
+          <w:noProof/>
+        </w:rPr>
         <w:drawing>
           <wp:inline distT="0" distB="0" distL="0" distR="0" wp14:anchorId="61B3910D" wp14:editId="221D9B68">
             <wp:extent cx="5579745" cy="2260600"/>
@@ -185,6 +194,9 @@
     </w:p>
     <w:p>
       <w:r>
+        <w:rPr>
+          <w:noProof/>
+        </w:rPr>
         <w:drawing>
           <wp:inline distT="0" distB="0" distL="0" distR="0" wp14:anchorId="58A9CFB8" wp14:editId="0592A5C1">
             <wp:extent cx="3791479" cy="1590897"/>
@@ -231,6 +243,9 @@
     </w:p>
     <w:p>
       <w:r>
+        <w:rPr>
+          <w:noProof/>
+        </w:rPr>
         <w:drawing>
           <wp:inline distT="0" distB="0" distL="0" distR="0" wp14:anchorId="58682A79" wp14:editId="05140F93">
             <wp:extent cx="5579745" cy="1752600"/>
@@ -281,7 +296,12 @@
     </w:p>
     <w:p>
       <w:r>
-        <w:t>Disable SELinux</w:t>
+        <w:t>Truy cập /etc/selinux/config</w:t>
+      </w:r>
+    </w:p>
+    <w:p>
+      <w:r>
+        <w:t>SELINUX=disabled</w:t>
       </w:r>
     </w:p>
     <w:p>
@@ -430,7 +450,7 @@
     </w:p>
     <w:p>
       <w:pPr>
-        <w:pStyle w:val="oancuaDanhsach"/>
+        <w:pStyle w:val="ListParagraph"/>
         <w:numPr>
           <w:ilvl w:val="0"/>
           <w:numId w:val="4"/>
@@ -453,19 +473,19 @@
     </w:p>
     <w:p>
       <w:pPr>
-        <w:pStyle w:val="oancuaDanhsach"/>
+        <w:pStyle w:val="ListParagraph"/>
         <w:numPr>
           <w:ilvl w:val="0"/>
           <w:numId w:val="4"/>
         </w:numPr>
       </w:pPr>
       <w:r>
+        <w:lastRenderedPageBreak/>
         <w:t>Mở firewall</w:t>
       </w:r>
     </w:p>
     <w:p>
       <w:r>
-        <w:lastRenderedPageBreak/>
         <w:t>firewall-cmd --permanent --add-port=1812/udp</w:t>
       </w:r>
     </w:p>
@@ -487,7 +507,7 @@
     <w:p/>
     <w:p>
       <w:pPr>
-        <w:pStyle w:val="oancuaDanhsach"/>
+        <w:pStyle w:val="ListParagraph"/>
         <w:numPr>
           <w:ilvl w:val="0"/>
           <w:numId w:val="4"/>
@@ -509,7 +529,7 @@
     </w:p>
     <w:p>
       <w:pPr>
-        <w:pStyle w:val="oancuaDanhsach"/>
+        <w:pStyle w:val="ListParagraph"/>
         <w:numPr>
           <w:ilvl w:val="0"/>
           <w:numId w:val="4"/>
@@ -626,6 +646,7 @@
     </w:p>
     <w:p>
       <w:r>
+        <w:lastRenderedPageBreak/>
         <w:t>ln -s /etc/raddb/mods-available/pam /etc/raddb/mods-enabled/pam</w:t>
       </w:r>
     </w:p>
@@ -689,6 +710,9 @@
     </w:p>
     <w:p>
       <w:r>
+        <w:rPr>
+          <w:noProof/>
+        </w:rPr>
         <w:drawing>
           <wp:inline distT="0" distB="0" distL="0" distR="0" wp14:anchorId="6BD4B505" wp14:editId="6BD7EAAB">
             <wp:extent cx="5579745" cy="941705"/>
@@ -766,6 +790,9 @@
     </w:p>
     <w:p>
       <w:r>
+        <w:rPr>
+          <w:noProof/>
+        </w:rPr>
         <w:lastRenderedPageBreak/>
         <w:drawing>
           <wp:inline distT="0" distB="0" distL="0" distR="0" wp14:anchorId="24E6BFA1" wp14:editId="4377D9F1">
@@ -835,9 +862,6 @@
       <w:r>
         <w:t>update-crypto-policies --set DEFAULT:AD-SUPPORT</w:t>
       </w:r>
-      <w:r>
-        <w:t>-LEGACY</w:t>
-      </w:r>
     </w:p>
     <w:p>
       <w:r>
@@ -850,6 +874,241 @@
       </w:r>
       <w:r>
         <w:t>demo.local</w:t>
+      </w:r>
+    </w:p>
+    <w:p/>
+    <w:p>
+      <w:r>
+        <w:t>Cấu hình bổ sung sssd</w:t>
+      </w:r>
+    </w:p>
+    <w:p>
+      <w:r>
+        <w:t>nano /etc/sssd/sssd.conf</w:t>
+      </w:r>
+    </w:p>
+    <w:p>
+      <w:r>
+        <w:t>default_domain_suffix = demo.local</w:t>
+      </w:r>
+    </w:p>
+    <w:p/>
+    <w:p>
+      <w:r>
+        <w:t>Nếu cấu hình thành công, ta có thể pull administrator password</w:t>
+      </w:r>
+    </w:p>
+    <w:p>
+      <w:r>
+        <w:t xml:space="preserve">getent passwd </w:t>
+      </w:r>
+      <w:hyperlink r:id="rId13" w:history="1">
+        <w:r>
+          <w:rPr>
+            <w:rStyle w:val="Hyperlink"/>
+          </w:rPr>
+          <w:t>administrator@</w:t>
+        </w:r>
+        <w:r>
+          <w:rPr>
+            <w:rStyle w:val="Hyperlink"/>
+          </w:rPr>
+          <w:t>demo</w:t>
+        </w:r>
+        <w:r>
+          <w:rPr>
+            <w:rStyle w:val="Hyperlink"/>
+          </w:rPr>
+          <w:t>.local</w:t>
+        </w:r>
+      </w:hyperlink>
+    </w:p>
+    <w:p/>
+    <w:p>
+      <w:r>
+        <w:t xml:space="preserve">Cấu hình </w:t>
+      </w:r>
+    </w:p>
+    <w:p>
+      <w:r>
+        <w:t xml:space="preserve">realm permit </w:t>
+      </w:r>
+      <w:r>
+        <w:t>–</w:t>
+      </w:r>
+      <w:r>
+        <w:t>al</w:t>
+      </w:r>
+      <w:r>
+        <w:t>l</w:t>
+      </w:r>
+    </w:p>
+    <w:p>
+      <w:r>
+        <w:t xml:space="preserve">realm permit -g </w:t>
+      </w:r>
+      <w:r>
+        <w:t>users</w:t>
+      </w:r>
+    </w:p>
+    <w:p>
+      <w:r>
+        <w:t xml:space="preserve">realm permit </w:t>
+      </w:r>
+      <w:hyperlink r:id="rId14" w:history="1">
+        <w:r>
+          <w:rPr>
+            <w:rStyle w:val="Hyperlink"/>
+          </w:rPr>
+          <w:t>administrator@demo.local</w:t>
+        </w:r>
+      </w:hyperlink>
+    </w:p>
+    <w:p>
+      <w:r>
+        <w:t xml:space="preserve">realm permit </w:t>
+      </w:r>
+      <w:hyperlink r:id="rId15" w:history="1">
+        <w:r>
+          <w:rPr>
+            <w:rStyle w:val="Hyperlink"/>
+          </w:rPr>
+          <w:t>demo-01@demo.local</w:t>
+        </w:r>
+      </w:hyperlink>
+    </w:p>
+    <w:p/>
+    <w:p>
+      <w:r>
+        <w:t xml:space="preserve">Cài đặt </w:t>
+      </w:r>
+    </w:p>
+    <w:p>
+      <w:r>
+        <w:t>dnf install -y epel-release</w:t>
+      </w:r>
+    </w:p>
+    <w:p>
+      <w:r>
+        <w:lastRenderedPageBreak/>
+        <w:t>dnf update</w:t>
+      </w:r>
+    </w:p>
+    <w:p>
+      <w:r>
+        <w:t>dnf install -y google-authenticator qrencode</w:t>
+      </w:r>
+    </w:p>
+    <w:p>
+      <w:r>
+        <w:t>google-authenticator</w:t>
+      </w:r>
+    </w:p>
+    <w:p>
+      <w:r>
+        <w:drawing>
+          <wp:inline distT="0" distB="0" distL="0" distR="0" wp14:anchorId="216F210C" wp14:editId="41209B84">
+            <wp:extent cx="5579745" cy="4935220"/>
+            <wp:effectExtent l="0" t="0" r="1905" b="0"/>
+            <wp:docPr id="688282341" name="Picture 1"/>
+            <wp:cNvGraphicFramePr>
+              <a:graphicFrameLocks xmlns:a="http://schemas.openxmlformats.org/drawingml/2006/main" noChangeAspect="1"/>
+            </wp:cNvGraphicFramePr>
+            <a:graphic xmlns:a="http://schemas.openxmlformats.org/drawingml/2006/main">
+              <a:graphicData uri="http://schemas.openxmlformats.org/drawingml/2006/picture">
+                <pic:pic xmlns:pic="http://schemas.openxmlformats.org/drawingml/2006/picture">
+                  <pic:nvPicPr>
+                    <pic:cNvPr id="688282341" name=""/>
+                    <pic:cNvPicPr/>
+                  </pic:nvPicPr>
+                  <pic:blipFill>
+                    <a:blip r:embed="rId16"/>
+                    <a:stretch>
+                      <a:fillRect/>
+                    </a:stretch>
+                  </pic:blipFill>
+                  <pic:spPr>
+                    <a:xfrm>
+                      <a:off x="0" y="0"/>
+                      <a:ext cx="5579745" cy="4935220"/>
+                    </a:xfrm>
+                    <a:prstGeom prst="rect">
+                      <a:avLst/>
+                    </a:prstGeom>
+                  </pic:spPr>
+                </pic:pic>
+              </a:graphicData>
+            </a:graphic>
+          </wp:inline>
+        </w:drawing>
+      </w:r>
+    </w:p>
+    <w:p/>
+    <w:p>
+      <w:r>
+        <w:t>Cấu hình pam</w:t>
+      </w:r>
+    </w:p>
+    <w:p>
+      <w:r>
+        <w:t>nano</w:t>
+      </w:r>
+      <w:r>
+        <w:t xml:space="preserve"> /etc/pam.d/radiusd</w:t>
+      </w:r>
+    </w:p>
+    <w:p>
+      <w:r>
+        <w:t>auth       requisite    pam_google_authenticator.so forward_pass</w:t>
+      </w:r>
+    </w:p>
+    <w:p>
+      <w:r>
+        <w:t>auth       required     pam_sss.so use_first_pass</w:t>
+      </w:r>
+    </w:p>
+    <w:p>
+      <w:r>
+        <w:t>account    required     pam_nologin.so</w:t>
+      </w:r>
+    </w:p>
+    <w:p>
+      <w:r>
+        <w:t>account    include      password-auth</w:t>
+      </w:r>
+    </w:p>
+    <w:p>
+      <w:r>
+        <w:t>session    include      password-auth</w:t>
+      </w:r>
+    </w:p>
+    <w:p>
+      <w:r>
+        <w:lastRenderedPageBreak/>
+        <w:t>Test kết nối</w:t>
+      </w:r>
+    </w:p>
+    <w:p>
+      <w:r>
+        <w:t xml:space="preserve">radtest </w:t>
+      </w:r>
+      <w:r>
+        <w:t>demo-01</w:t>
+      </w:r>
+      <w:r>
+        <w:t xml:space="preserve"> </w:t>
+      </w:r>
+      <w:r>
+        <w:t>Vtdc@2026&lt;otp&gt;</w:t>
+      </w:r>
+      <w:r>
+        <w:t xml:space="preserve"> localhost 0 test123</w:t>
+      </w:r>
+    </w:p>
+    <w:p/>
+    <w:p>
+      <w:r>
+        <w:t>Kết quả ra Accept-Accept là ok</w:t>
       </w:r>
     </w:p>
     <w:p/>
@@ -1756,15 +2015,15 @@
     <w:lsdException w:name="Unresolved Mention" w:semiHidden="1" w:unhideWhenUsed="1"/>
     <w:lsdException w:name="Smart Link" w:semiHidden="1" w:unhideWhenUsed="1"/>
   </w:latentStyles>
-  <w:style w:type="paragraph" w:default="1" w:styleId="Binhthng">
+  <w:style w:type="paragraph" w:default="1" w:styleId="Normal">
     <w:name w:val="Normal"/>
     <w:qFormat/>
   </w:style>
-  <w:style w:type="paragraph" w:styleId="u1">
+  <w:style w:type="paragraph" w:styleId="Heading1">
     <w:name w:val="heading 1"/>
-    <w:basedOn w:val="Binhthng"/>
-    <w:next w:val="Binhthng"/>
-    <w:link w:val="u1Char"/>
+    <w:basedOn w:val="Normal"/>
+    <w:next w:val="Normal"/>
+    <w:link w:val="Heading1Char"/>
     <w:uiPriority w:val="9"/>
     <w:qFormat/>
     <w:rsid w:val="0005227F"/>
@@ -1781,11 +2040,11 @@
       <w:szCs w:val="40"/>
     </w:rPr>
   </w:style>
-  <w:style w:type="paragraph" w:styleId="u2">
+  <w:style w:type="paragraph" w:styleId="Heading2">
     <w:name w:val="heading 2"/>
-    <w:basedOn w:val="Binhthng"/>
-    <w:next w:val="Binhthng"/>
-    <w:link w:val="u2Char"/>
+    <w:basedOn w:val="Normal"/>
+    <w:next w:val="Normal"/>
+    <w:link w:val="Heading2Char"/>
     <w:uiPriority w:val="9"/>
     <w:semiHidden/>
     <w:unhideWhenUsed/>
@@ -1804,11 +2063,11 @@
       <w:szCs w:val="32"/>
     </w:rPr>
   </w:style>
-  <w:style w:type="paragraph" w:styleId="u3">
+  <w:style w:type="paragraph" w:styleId="Heading3">
     <w:name w:val="heading 3"/>
-    <w:basedOn w:val="Binhthng"/>
-    <w:next w:val="Binhthng"/>
-    <w:link w:val="u3Char"/>
+    <w:basedOn w:val="Normal"/>
+    <w:next w:val="Normal"/>
+    <w:link w:val="Heading3Char"/>
     <w:uiPriority w:val="9"/>
     <w:semiHidden/>
     <w:unhideWhenUsed/>
@@ -1827,11 +2086,11 @@
       <w:szCs w:val="28"/>
     </w:rPr>
   </w:style>
-  <w:style w:type="paragraph" w:styleId="u4">
+  <w:style w:type="paragraph" w:styleId="Heading4">
     <w:name w:val="heading 4"/>
-    <w:basedOn w:val="Binhthng"/>
-    <w:next w:val="Binhthng"/>
-    <w:link w:val="u4Char"/>
+    <w:basedOn w:val="Normal"/>
+    <w:next w:val="Normal"/>
+    <w:link w:val="Heading4Char"/>
     <w:uiPriority w:val="9"/>
     <w:semiHidden/>
     <w:unhideWhenUsed/>
@@ -1850,11 +2109,11 @@
       <w:color w:val="2F5496" w:themeColor="accent1" w:themeShade="BF"/>
     </w:rPr>
   </w:style>
-  <w:style w:type="paragraph" w:styleId="u5">
+  <w:style w:type="paragraph" w:styleId="Heading5">
     <w:name w:val="heading 5"/>
-    <w:basedOn w:val="Binhthng"/>
-    <w:next w:val="Binhthng"/>
-    <w:link w:val="u5Char"/>
+    <w:basedOn w:val="Normal"/>
+    <w:next w:val="Normal"/>
+    <w:link w:val="Heading5Char"/>
     <w:uiPriority w:val="9"/>
     <w:semiHidden/>
     <w:unhideWhenUsed/>
@@ -1871,11 +2130,11 @@
       <w:color w:val="2F5496" w:themeColor="accent1" w:themeShade="BF"/>
     </w:rPr>
   </w:style>
-  <w:style w:type="paragraph" w:styleId="u6">
+  <w:style w:type="paragraph" w:styleId="Heading6">
     <w:name w:val="heading 6"/>
-    <w:basedOn w:val="Binhthng"/>
-    <w:next w:val="Binhthng"/>
-    <w:link w:val="u6Char"/>
+    <w:basedOn w:val="Normal"/>
+    <w:next w:val="Normal"/>
+    <w:link w:val="Heading6Char"/>
     <w:uiPriority w:val="9"/>
     <w:semiHidden/>
     <w:unhideWhenUsed/>
@@ -1894,11 +2153,11 @@
       <w:color w:val="595959" w:themeColor="text1" w:themeTint="A6"/>
     </w:rPr>
   </w:style>
-  <w:style w:type="paragraph" w:styleId="u7">
+  <w:style w:type="paragraph" w:styleId="Heading7">
     <w:name w:val="heading 7"/>
-    <w:basedOn w:val="Binhthng"/>
-    <w:next w:val="Binhthng"/>
-    <w:link w:val="u7Char"/>
+    <w:basedOn w:val="Normal"/>
+    <w:next w:val="Normal"/>
+    <w:link w:val="Heading7Char"/>
     <w:uiPriority w:val="9"/>
     <w:semiHidden/>
     <w:unhideWhenUsed/>
@@ -1915,11 +2174,11 @@
       <w:color w:val="595959" w:themeColor="text1" w:themeTint="A6"/>
     </w:rPr>
   </w:style>
-  <w:style w:type="paragraph" w:styleId="u8">
+  <w:style w:type="paragraph" w:styleId="Heading8">
     <w:name w:val="heading 8"/>
-    <w:basedOn w:val="Binhthng"/>
-    <w:next w:val="Binhthng"/>
-    <w:link w:val="u8Char"/>
+    <w:basedOn w:val="Normal"/>
+    <w:next w:val="Normal"/>
+    <w:link w:val="Heading8Char"/>
     <w:uiPriority w:val="9"/>
     <w:semiHidden/>
     <w:unhideWhenUsed/>
@@ -1938,11 +2197,11 @@
       <w:color w:val="272727" w:themeColor="text1" w:themeTint="D8"/>
     </w:rPr>
   </w:style>
-  <w:style w:type="paragraph" w:styleId="u9">
+  <w:style w:type="paragraph" w:styleId="Heading9">
     <w:name w:val="heading 9"/>
-    <w:basedOn w:val="Binhthng"/>
-    <w:next w:val="Binhthng"/>
-    <w:link w:val="u9Char"/>
+    <w:basedOn w:val="Normal"/>
+    <w:next w:val="Normal"/>
+    <w:link w:val="Heading9Char"/>
     <w:uiPriority w:val="9"/>
     <w:semiHidden/>
     <w:unhideWhenUsed/>
@@ -1959,12 +2218,12 @@
       <w:color w:val="272727" w:themeColor="text1" w:themeTint="D8"/>
     </w:rPr>
   </w:style>
-  <w:style w:type="character" w:default="1" w:styleId="Phngmcinhcuaoanvn">
+  <w:style w:type="character" w:default="1" w:styleId="DefaultParagraphFont">
     <w:name w:val="Default Paragraph Font"/>
     <w:uiPriority w:val="1"/>
     <w:unhideWhenUsed/>
   </w:style>
-  <w:style w:type="table" w:default="1" w:styleId="BangThngthng">
+  <w:style w:type="table" w:default="1" w:styleId="TableNormal">
     <w:name w:val="Normal Table"/>
     <w:uiPriority w:val="99"/>
     <w:semiHidden/>
@@ -1979,16 +2238,16 @@
       </w:tblCellMar>
     </w:tblPr>
   </w:style>
-  <w:style w:type="numbering" w:default="1" w:styleId="Khngco">
+  <w:style w:type="numbering" w:default="1" w:styleId="NoList">
     <w:name w:val="No List"/>
     <w:uiPriority w:val="99"/>
     <w:semiHidden/>
     <w:unhideWhenUsed/>
   </w:style>
-  <w:style w:type="character" w:customStyle="1" w:styleId="u1Char">
-    <w:name w:val="Đầu đề 1 Char"/>
-    <w:basedOn w:val="Phngmcinhcuaoanvn"/>
-    <w:link w:val="u1"/>
+  <w:style w:type="character" w:customStyle="1" w:styleId="Heading1Char">
+    <w:name w:val="Heading 1 Char"/>
+    <w:basedOn w:val="DefaultParagraphFont"/>
+    <w:link w:val="Heading1"/>
     <w:uiPriority w:val="9"/>
     <w:rsid w:val="0005227F"/>
     <w:rPr>
@@ -1998,10 +2257,10 @@
       <w:szCs w:val="40"/>
     </w:rPr>
   </w:style>
-  <w:style w:type="character" w:customStyle="1" w:styleId="u2Char">
-    <w:name w:val="Đầu đề 2 Char"/>
-    <w:basedOn w:val="Phngmcinhcuaoanvn"/>
-    <w:link w:val="u2"/>
+  <w:style w:type="character" w:customStyle="1" w:styleId="Heading2Char">
+    <w:name w:val="Heading 2 Char"/>
+    <w:basedOn w:val="DefaultParagraphFont"/>
+    <w:link w:val="Heading2"/>
     <w:uiPriority w:val="9"/>
     <w:semiHidden/>
     <w:rsid w:val="0005227F"/>
@@ -2012,10 +2271,10 @@
       <w:szCs w:val="32"/>
     </w:rPr>
   </w:style>
-  <w:style w:type="character" w:customStyle="1" w:styleId="u3Char">
-    <w:name w:val="Đầu đề 3 Char"/>
-    <w:basedOn w:val="Phngmcinhcuaoanvn"/>
-    <w:link w:val="u3"/>
+  <w:style w:type="character" w:customStyle="1" w:styleId="Heading3Char">
+    <w:name w:val="Heading 3 Char"/>
+    <w:basedOn w:val="DefaultParagraphFont"/>
+    <w:link w:val="Heading3"/>
     <w:uiPriority w:val="9"/>
     <w:semiHidden/>
     <w:rsid w:val="0005227F"/>
@@ -2026,10 +2285,10 @@
       <w:szCs w:val="28"/>
     </w:rPr>
   </w:style>
-  <w:style w:type="character" w:customStyle="1" w:styleId="u4Char">
-    <w:name w:val="Đầu đề 4 Char"/>
-    <w:basedOn w:val="Phngmcinhcuaoanvn"/>
-    <w:link w:val="u4"/>
+  <w:style w:type="character" w:customStyle="1" w:styleId="Heading4Char">
+    <w:name w:val="Heading 4 Char"/>
+    <w:basedOn w:val="DefaultParagraphFont"/>
+    <w:link w:val="Heading4"/>
     <w:uiPriority w:val="9"/>
     <w:semiHidden/>
     <w:rsid w:val="0005227F"/>
@@ -2040,10 +2299,10 @@
       <w:color w:val="2F5496" w:themeColor="accent1" w:themeShade="BF"/>
     </w:rPr>
   </w:style>
-  <w:style w:type="character" w:customStyle="1" w:styleId="u5Char">
-    <w:name w:val="Đầu đề 5 Char"/>
-    <w:basedOn w:val="Phngmcinhcuaoanvn"/>
-    <w:link w:val="u5"/>
+  <w:style w:type="character" w:customStyle="1" w:styleId="Heading5Char">
+    <w:name w:val="Heading 5 Char"/>
+    <w:basedOn w:val="DefaultParagraphFont"/>
+    <w:link w:val="Heading5"/>
     <w:uiPriority w:val="9"/>
     <w:semiHidden/>
     <w:rsid w:val="0005227F"/>
@@ -2052,10 +2311,10 @@
       <w:color w:val="2F5496" w:themeColor="accent1" w:themeShade="BF"/>
     </w:rPr>
   </w:style>
-  <w:style w:type="character" w:customStyle="1" w:styleId="u6Char">
-    <w:name w:val="Đầu đề 6 Char"/>
-    <w:basedOn w:val="Phngmcinhcuaoanvn"/>
-    <w:link w:val="u6"/>
+  <w:style w:type="character" w:customStyle="1" w:styleId="Heading6Char">
+    <w:name w:val="Heading 6 Char"/>
+    <w:basedOn w:val="DefaultParagraphFont"/>
+    <w:link w:val="Heading6"/>
     <w:uiPriority w:val="9"/>
     <w:semiHidden/>
     <w:rsid w:val="0005227F"/>
@@ -2066,10 +2325,10 @@
       <w:color w:val="595959" w:themeColor="text1" w:themeTint="A6"/>
     </w:rPr>
   </w:style>
-  <w:style w:type="character" w:customStyle="1" w:styleId="u7Char">
-    <w:name w:val="Đầu đề 7 Char"/>
-    <w:basedOn w:val="Phngmcinhcuaoanvn"/>
-    <w:link w:val="u7"/>
+  <w:style w:type="character" w:customStyle="1" w:styleId="Heading7Char">
+    <w:name w:val="Heading 7 Char"/>
+    <w:basedOn w:val="DefaultParagraphFont"/>
+    <w:link w:val="Heading7"/>
     <w:uiPriority w:val="9"/>
     <w:semiHidden/>
     <w:rsid w:val="0005227F"/>
@@ -2078,10 +2337,10 @@
       <w:color w:val="595959" w:themeColor="text1" w:themeTint="A6"/>
     </w:rPr>
   </w:style>
-  <w:style w:type="character" w:customStyle="1" w:styleId="u8Char">
-    <w:name w:val="Đầu đề 8 Char"/>
-    <w:basedOn w:val="Phngmcinhcuaoanvn"/>
-    <w:link w:val="u8"/>
+  <w:style w:type="character" w:customStyle="1" w:styleId="Heading8Char">
+    <w:name w:val="Heading 8 Char"/>
+    <w:basedOn w:val="DefaultParagraphFont"/>
+    <w:link w:val="Heading8"/>
     <w:uiPriority w:val="9"/>
     <w:semiHidden/>
     <w:rsid w:val="0005227F"/>
@@ -2092,10 +2351,10 @@
       <w:color w:val="272727" w:themeColor="text1" w:themeTint="D8"/>
     </w:rPr>
   </w:style>
-  <w:style w:type="character" w:customStyle="1" w:styleId="u9Char">
-    <w:name w:val="Đầu đề 9 Char"/>
-    <w:basedOn w:val="Phngmcinhcuaoanvn"/>
-    <w:link w:val="u9"/>
+  <w:style w:type="character" w:customStyle="1" w:styleId="Heading9Char">
+    <w:name w:val="Heading 9 Char"/>
+    <w:basedOn w:val="DefaultParagraphFont"/>
+    <w:link w:val="Heading9"/>
     <w:uiPriority w:val="9"/>
     <w:semiHidden/>
     <w:rsid w:val="0005227F"/>
@@ -2104,11 +2363,11 @@
       <w:color w:val="272727" w:themeColor="text1" w:themeTint="D8"/>
     </w:rPr>
   </w:style>
-  <w:style w:type="paragraph" w:styleId="Tiu">
+  <w:style w:type="paragraph" w:styleId="Title">
     <w:name w:val="Title"/>
-    <w:basedOn w:val="Binhthng"/>
-    <w:next w:val="Binhthng"/>
-    <w:link w:val="TiuChar"/>
+    <w:basedOn w:val="Normal"/>
+    <w:next w:val="Normal"/>
+    <w:link w:val="TitleChar"/>
     <w:uiPriority w:val="10"/>
     <w:qFormat/>
     <w:rsid w:val="0005227F"/>
@@ -2124,10 +2383,10 @@
       <w:szCs w:val="56"/>
     </w:rPr>
   </w:style>
-  <w:style w:type="character" w:customStyle="1" w:styleId="TiuChar">
-    <w:name w:val="Tiêu đề Char"/>
-    <w:basedOn w:val="Phngmcinhcuaoanvn"/>
-    <w:link w:val="Tiu"/>
+  <w:style w:type="character" w:customStyle="1" w:styleId="TitleChar">
+    <w:name w:val="Title Char"/>
+    <w:basedOn w:val="DefaultParagraphFont"/>
+    <w:link w:val="Title"/>
     <w:uiPriority w:val="10"/>
     <w:rsid w:val="0005227F"/>
     <w:rPr>
@@ -2138,11 +2397,11 @@
       <w:szCs w:val="56"/>
     </w:rPr>
   </w:style>
-  <w:style w:type="paragraph" w:styleId="Tiuphu">
+  <w:style w:type="paragraph" w:styleId="Subtitle">
     <w:name w:val="Subtitle"/>
-    <w:basedOn w:val="Binhthng"/>
-    <w:next w:val="Binhthng"/>
-    <w:link w:val="TiuphuChar"/>
+    <w:basedOn w:val="Normal"/>
+    <w:next w:val="Normal"/>
+    <w:link w:val="SubtitleChar"/>
     <w:uiPriority w:val="11"/>
     <w:qFormat/>
     <w:rsid w:val="0005227F"/>
@@ -2159,10 +2418,10 @@
       <w:szCs w:val="28"/>
     </w:rPr>
   </w:style>
-  <w:style w:type="character" w:customStyle="1" w:styleId="TiuphuChar">
-    <w:name w:val="Tiêu đề phụ Char"/>
-    <w:basedOn w:val="Phngmcinhcuaoanvn"/>
-    <w:link w:val="Tiuphu"/>
+  <w:style w:type="character" w:customStyle="1" w:styleId="SubtitleChar">
+    <w:name w:val="Subtitle Char"/>
+    <w:basedOn w:val="DefaultParagraphFont"/>
+    <w:link w:val="Subtitle"/>
     <w:uiPriority w:val="11"/>
     <w:rsid w:val="0005227F"/>
     <w:rPr>
@@ -2173,11 +2432,11 @@
       <w:szCs w:val="28"/>
     </w:rPr>
   </w:style>
-  <w:style w:type="paragraph" w:styleId="Litrichdn">
+  <w:style w:type="paragraph" w:styleId="Quote">
     <w:name w:val="Quote"/>
-    <w:basedOn w:val="Binhthng"/>
-    <w:next w:val="Binhthng"/>
-    <w:link w:val="LitrichdnChar"/>
+    <w:basedOn w:val="Normal"/>
+    <w:next w:val="Normal"/>
+    <w:link w:val="QuoteChar"/>
     <w:uiPriority w:val="29"/>
     <w:qFormat/>
     <w:rsid w:val="0005227F"/>
@@ -2191,10 +2450,10 @@
       <w:color w:val="404040" w:themeColor="text1" w:themeTint="BF"/>
     </w:rPr>
   </w:style>
-  <w:style w:type="character" w:customStyle="1" w:styleId="LitrichdnChar">
-    <w:name w:val="Lời trích dẫn Char"/>
-    <w:basedOn w:val="Phngmcinhcuaoanvn"/>
-    <w:link w:val="Litrichdn"/>
+  <w:style w:type="character" w:customStyle="1" w:styleId="QuoteChar">
+    <w:name w:val="Quote Char"/>
+    <w:basedOn w:val="DefaultParagraphFont"/>
+    <w:link w:val="Quote"/>
     <w:uiPriority w:val="29"/>
     <w:rsid w:val="0005227F"/>
     <w:rPr>
@@ -2203,9 +2462,9 @@
       <w:color w:val="404040" w:themeColor="text1" w:themeTint="BF"/>
     </w:rPr>
   </w:style>
-  <w:style w:type="paragraph" w:styleId="oancuaDanhsach">
+  <w:style w:type="paragraph" w:styleId="ListParagraph">
     <w:name w:val="List Paragraph"/>
-    <w:basedOn w:val="Binhthng"/>
+    <w:basedOn w:val="Normal"/>
     <w:uiPriority w:val="34"/>
     <w:qFormat/>
     <w:rsid w:val="0005227F"/>
@@ -2214,9 +2473,9 @@
       <w:contextualSpacing/>
     </w:pPr>
   </w:style>
-  <w:style w:type="character" w:styleId="NhnmnhThm">
+  <w:style w:type="character" w:styleId="IntenseEmphasis">
     <w:name w:val="Intense Emphasis"/>
-    <w:basedOn w:val="Phngmcinhcuaoanvn"/>
+    <w:basedOn w:val="DefaultParagraphFont"/>
     <w:uiPriority w:val="21"/>
     <w:qFormat/>
     <w:rsid w:val="0005227F"/>
@@ -2226,11 +2485,11 @@
       <w:color w:val="2F5496" w:themeColor="accent1" w:themeShade="BF"/>
     </w:rPr>
   </w:style>
-  <w:style w:type="paragraph" w:styleId="Nhaykepm">
+  <w:style w:type="paragraph" w:styleId="IntenseQuote">
     <w:name w:val="Intense Quote"/>
-    <w:basedOn w:val="Binhthng"/>
-    <w:next w:val="Binhthng"/>
-    <w:link w:val="NhaykepmChar"/>
+    <w:basedOn w:val="Normal"/>
+    <w:next w:val="Normal"/>
+    <w:link w:val="IntenseQuoteChar"/>
     <w:uiPriority w:val="30"/>
     <w:qFormat/>
     <w:rsid w:val="0005227F"/>
@@ -2249,10 +2508,10 @@
       <w:color w:val="2F5496" w:themeColor="accent1" w:themeShade="BF"/>
     </w:rPr>
   </w:style>
-  <w:style w:type="character" w:customStyle="1" w:styleId="NhaykepmChar">
-    <w:name w:val="Nháy kép Đậm Char"/>
-    <w:basedOn w:val="Phngmcinhcuaoanvn"/>
-    <w:link w:val="Nhaykepm"/>
+  <w:style w:type="character" w:customStyle="1" w:styleId="IntenseQuoteChar">
+    <w:name w:val="Intense Quote Char"/>
+    <w:basedOn w:val="DefaultParagraphFont"/>
+    <w:link w:val="IntenseQuote"/>
     <w:uiPriority w:val="30"/>
     <w:rsid w:val="0005227F"/>
     <w:rPr>
@@ -2261,9 +2520,9 @@
       <w:color w:val="2F5496" w:themeColor="accent1" w:themeShade="BF"/>
     </w:rPr>
   </w:style>
-  <w:style w:type="character" w:styleId="ThamchiuNhnmnh">
+  <w:style w:type="character" w:styleId="IntenseReference">
     <w:name w:val="Intense Reference"/>
-    <w:basedOn w:val="Phngmcinhcuaoanvn"/>
+    <w:basedOn w:val="DefaultParagraphFont"/>
     <w:uiPriority w:val="32"/>
     <w:qFormat/>
     <w:rsid w:val="0005227F"/>
@@ -2275,9 +2534,9 @@
       <w:spacing w:val="5"/>
     </w:rPr>
   </w:style>
-  <w:style w:type="character" w:styleId="Siuktni">
+  <w:style w:type="character" w:styleId="Hyperlink">
     <w:name w:val="Hyperlink"/>
-    <w:basedOn w:val="Phngmcinhcuaoanvn"/>
+    <w:basedOn w:val="DefaultParagraphFont"/>
     <w:uiPriority w:val="99"/>
     <w:unhideWhenUsed/>
     <w:rsid w:val="0005227F"/>
@@ -2286,9 +2545,9 @@
       <w:u w:val="single"/>
     </w:rPr>
   </w:style>
-  <w:style w:type="character" w:styleId="cpChagiiquyt">
+  <w:style w:type="character" w:styleId="UnresolvedMention">
     <w:name w:val="Unresolved Mention"/>
-    <w:basedOn w:val="Phngmcinhcuaoanvn"/>
+    <w:basedOn w:val="DefaultParagraphFont"/>
     <w:uiPriority w:val="99"/>
     <w:semiHidden/>
     <w:unhideWhenUsed/>
@@ -2298,10 +2557,10 @@
       <w:shd w:val="clear" w:color="auto" w:fill="E1DFDD"/>
     </w:rPr>
   </w:style>
-  <w:style w:type="paragraph" w:styleId="HTMLinhdangtrc">
+  <w:style w:type="paragraph" w:styleId="HTMLPreformatted">
     <w:name w:val="HTML Preformatted"/>
-    <w:basedOn w:val="Binhthng"/>
-    <w:link w:val="HTMLinhdangtrcChar"/>
+    <w:basedOn w:val="Normal"/>
+    <w:link w:val="HTMLPreformattedChar"/>
     <w:uiPriority w:val="99"/>
     <w:semiHidden/>
     <w:unhideWhenUsed/>
@@ -2315,10 +2574,10 @@
       <w:szCs w:val="20"/>
     </w:rPr>
   </w:style>
-  <w:style w:type="character" w:customStyle="1" w:styleId="HTMLinhdangtrcChar">
-    <w:name w:val="HTML Định dạng trước Char"/>
-    <w:basedOn w:val="Phngmcinhcuaoanvn"/>
-    <w:link w:val="HTMLinhdangtrc"/>
+  <w:style w:type="character" w:customStyle="1" w:styleId="HTMLPreformattedChar">
+    <w:name w:val="HTML Preformatted Char"/>
+    <w:basedOn w:val="DefaultParagraphFont"/>
+    <w:link w:val="HTMLPreformatted"/>
     <w:uiPriority w:val="99"/>
     <w:semiHidden/>
     <w:rsid w:val="00F00166"/>

</xml_diff>

<commit_message>
cap nhap tai lieu he thong
</commit_message>
<xml_diff>
--- a/vmware/Hướng dẫn cài đặt Free Radius tích hợp AD triển khai hệ thống xác thực 2 lớp cho dịch vụ Vmware UAG.docx
+++ b/vmware/Hướng dẫn cài đặt Free Radius tích hợp AD triển khai hệ thống xác thực 2 lớp cho dịch vụ Vmware UAG.docx
@@ -20,7 +20,7 @@
       <w:hyperlink r:id="rId5" w:history="1">
         <w:r>
           <w:rPr>
-            <w:rStyle w:val="Hyperlink"/>
+            <w:rStyle w:val="Siuktni"/>
           </w:rPr>
           <w:t>https://rockylinux.org/download</w:t>
         </w:r>
@@ -450,7 +450,7 @@
     </w:p>
     <w:p>
       <w:pPr>
-        <w:pStyle w:val="ListParagraph"/>
+        <w:pStyle w:val="oancuaDanhsach"/>
         <w:numPr>
           <w:ilvl w:val="0"/>
           <w:numId w:val="4"/>
@@ -473,7 +473,7 @@
     </w:p>
     <w:p>
       <w:pPr>
-        <w:pStyle w:val="ListParagraph"/>
+        <w:pStyle w:val="oancuaDanhsach"/>
         <w:numPr>
           <w:ilvl w:val="0"/>
           <w:numId w:val="4"/>
@@ -507,7 +507,7 @@
     <w:p/>
     <w:p>
       <w:pPr>
-        <w:pStyle w:val="ListParagraph"/>
+        <w:pStyle w:val="oancuaDanhsach"/>
         <w:numPr>
           <w:ilvl w:val="0"/>
           <w:numId w:val="4"/>
@@ -529,7 +529,7 @@
     </w:p>
     <w:p>
       <w:pPr>
-        <w:pStyle w:val="ListParagraph"/>
+        <w:pStyle w:val="oancuaDanhsach"/>
         <w:numPr>
           <w:ilvl w:val="0"/>
           <w:numId w:val="4"/>
@@ -892,7 +892,16 @@
         <w:t>default_domain_suffix = demo.local</w:t>
       </w:r>
     </w:p>
-    <w:p/>
+    <w:p>
+      <w:r>
+        <w:t>access_provider = ad</w:t>
+      </w:r>
+    </w:p>
+    <w:p>
+      <w:r>
+        <w:t>ad_gpo_access_control = permissive</w:t>
+      </w:r>
+    </w:p>
     <w:p>
       <w:r>
         <w:t>Nếu cấu hình thành công, ta có thể pull administrator password</w:t>
@@ -905,65 +914,53 @@
       <w:hyperlink r:id="rId13" w:history="1">
         <w:r>
           <w:rPr>
-            <w:rStyle w:val="Hyperlink"/>
-          </w:rPr>
-          <w:t>administrator@</w:t>
-        </w:r>
-        <w:r>
-          <w:rPr>
-            <w:rStyle w:val="Hyperlink"/>
-          </w:rPr>
-          <w:t>demo</w:t>
-        </w:r>
-        <w:r>
-          <w:rPr>
-            <w:rStyle w:val="Hyperlink"/>
-          </w:rPr>
-          <w:t>.local</w:t>
-        </w:r>
-      </w:hyperlink>
-    </w:p>
-    <w:p/>
-    <w:p>
-      <w:r>
-        <w:t xml:space="preserve">Cấu hình </w:t>
-      </w:r>
-    </w:p>
-    <w:p>
-      <w:r>
-        <w:t xml:space="preserve">realm permit </w:t>
-      </w:r>
-      <w:r>
-        <w:t>–</w:t>
-      </w:r>
-      <w:r>
-        <w:t>al</w:t>
-      </w:r>
-      <w:r>
-        <w:t>l</w:t>
-      </w:r>
-    </w:p>
-    <w:p>
-      <w:r>
-        <w:t xml:space="preserve">realm permit -g </w:t>
-      </w:r>
-      <w:r>
-        <w:t>users</w:t>
-      </w:r>
-    </w:p>
-    <w:p>
-      <w:r>
-        <w:t xml:space="preserve">realm permit </w:t>
-      </w:r>
-      <w:hyperlink r:id="rId14" w:history="1">
-        <w:r>
-          <w:rPr>
-            <w:rStyle w:val="Hyperlink"/>
+            <w:rStyle w:val="Siuktni"/>
           </w:rPr>
           <w:t>administrator@demo.local</w:t>
         </w:r>
       </w:hyperlink>
     </w:p>
+    <w:p/>
+    <w:p>
+      <w:r>
+        <w:t xml:space="preserve">Cấu hình </w:t>
+      </w:r>
+    </w:p>
+    <w:p>
+      <w:r>
+        <w:t xml:space="preserve">realm permit </w:t>
+      </w:r>
+      <w:r>
+        <w:t>–</w:t>
+      </w:r>
+      <w:r>
+        <w:t>al</w:t>
+      </w:r>
+      <w:r>
+        <w:t>l</w:t>
+      </w:r>
+    </w:p>
+    <w:p>
+      <w:r>
+        <w:t xml:space="preserve">realm permit -g </w:t>
+      </w:r>
+      <w:r>
+        <w:t>users</w:t>
+      </w:r>
+    </w:p>
+    <w:p>
+      <w:r>
+        <w:t xml:space="preserve">realm permit </w:t>
+      </w:r>
+      <w:hyperlink r:id="rId14" w:history="1">
+        <w:r>
+          <w:rPr>
+            <w:rStyle w:val="Siuktni"/>
+          </w:rPr>
+          <w:t>administrator@demo.local</w:t>
+        </w:r>
+      </w:hyperlink>
+    </w:p>
     <w:p>
       <w:r>
         <w:t xml:space="preserve">realm permit </w:t>
@@ -971,7 +968,7 @@
       <w:hyperlink r:id="rId15" w:history="1">
         <w:r>
           <w:rPr>
-            <w:rStyle w:val="Hyperlink"/>
+            <w:rStyle w:val="Siuktni"/>
           </w:rPr>
           <w:t>demo-01@demo.local</w:t>
         </w:r>
@@ -985,12 +982,12 @@
     </w:p>
     <w:p>
       <w:r>
+        <w:lastRenderedPageBreak/>
         <w:t>dnf install -y epel-release</w:t>
       </w:r>
     </w:p>
     <w:p>
       <w:r>
-        <w:lastRenderedPageBreak/>
         <w:t>dnf update</w:t>
       </w:r>
     </w:p>
@@ -1006,6 +1003,9 @@
     </w:p>
     <w:p>
       <w:r>
+        <w:rPr>
+          <w:noProof/>
+        </w:rPr>
         <w:drawing>
           <wp:inline distT="0" distB="0" distL="0" distR="0" wp14:anchorId="216F210C" wp14:editId="41209B84">
             <wp:extent cx="5579745" cy="4935220"/>
@@ -1079,12 +1079,12 @@
     </w:p>
     <w:p>
       <w:r>
+        <w:lastRenderedPageBreak/>
         <w:t>session    include      password-auth</w:t>
       </w:r>
     </w:p>
     <w:p>
       <w:r>
-        <w:lastRenderedPageBreak/>
         <w:t>Test kết nối</w:t>
       </w:r>
     </w:p>
@@ -2015,15 +2015,15 @@
     <w:lsdException w:name="Unresolved Mention" w:semiHidden="1" w:unhideWhenUsed="1"/>
     <w:lsdException w:name="Smart Link" w:semiHidden="1" w:unhideWhenUsed="1"/>
   </w:latentStyles>
-  <w:style w:type="paragraph" w:default="1" w:styleId="Normal">
+  <w:style w:type="paragraph" w:default="1" w:styleId="Binhthng">
     <w:name w:val="Normal"/>
     <w:qFormat/>
   </w:style>
-  <w:style w:type="paragraph" w:styleId="Heading1">
+  <w:style w:type="paragraph" w:styleId="u1">
     <w:name w:val="heading 1"/>
-    <w:basedOn w:val="Normal"/>
-    <w:next w:val="Normal"/>
-    <w:link w:val="Heading1Char"/>
+    <w:basedOn w:val="Binhthng"/>
+    <w:next w:val="Binhthng"/>
+    <w:link w:val="u1Char"/>
     <w:uiPriority w:val="9"/>
     <w:qFormat/>
     <w:rsid w:val="0005227F"/>
@@ -2040,11 +2040,11 @@
       <w:szCs w:val="40"/>
     </w:rPr>
   </w:style>
-  <w:style w:type="paragraph" w:styleId="Heading2">
+  <w:style w:type="paragraph" w:styleId="u2">
     <w:name w:val="heading 2"/>
-    <w:basedOn w:val="Normal"/>
-    <w:next w:val="Normal"/>
-    <w:link w:val="Heading2Char"/>
+    <w:basedOn w:val="Binhthng"/>
+    <w:next w:val="Binhthng"/>
+    <w:link w:val="u2Char"/>
     <w:uiPriority w:val="9"/>
     <w:semiHidden/>
     <w:unhideWhenUsed/>
@@ -2063,11 +2063,11 @@
       <w:szCs w:val="32"/>
     </w:rPr>
   </w:style>
-  <w:style w:type="paragraph" w:styleId="Heading3">
+  <w:style w:type="paragraph" w:styleId="u3">
     <w:name w:val="heading 3"/>
-    <w:basedOn w:val="Normal"/>
-    <w:next w:val="Normal"/>
-    <w:link w:val="Heading3Char"/>
+    <w:basedOn w:val="Binhthng"/>
+    <w:next w:val="Binhthng"/>
+    <w:link w:val="u3Char"/>
     <w:uiPriority w:val="9"/>
     <w:semiHidden/>
     <w:unhideWhenUsed/>
@@ -2086,11 +2086,11 @@
       <w:szCs w:val="28"/>
     </w:rPr>
   </w:style>
-  <w:style w:type="paragraph" w:styleId="Heading4">
+  <w:style w:type="paragraph" w:styleId="u4">
     <w:name w:val="heading 4"/>
-    <w:basedOn w:val="Normal"/>
-    <w:next w:val="Normal"/>
-    <w:link w:val="Heading4Char"/>
+    <w:basedOn w:val="Binhthng"/>
+    <w:next w:val="Binhthng"/>
+    <w:link w:val="u4Char"/>
     <w:uiPriority w:val="9"/>
     <w:semiHidden/>
     <w:unhideWhenUsed/>
@@ -2109,11 +2109,11 @@
       <w:color w:val="2F5496" w:themeColor="accent1" w:themeShade="BF"/>
     </w:rPr>
   </w:style>
-  <w:style w:type="paragraph" w:styleId="Heading5">
+  <w:style w:type="paragraph" w:styleId="u5">
     <w:name w:val="heading 5"/>
-    <w:basedOn w:val="Normal"/>
-    <w:next w:val="Normal"/>
-    <w:link w:val="Heading5Char"/>
+    <w:basedOn w:val="Binhthng"/>
+    <w:next w:val="Binhthng"/>
+    <w:link w:val="u5Char"/>
     <w:uiPriority w:val="9"/>
     <w:semiHidden/>
     <w:unhideWhenUsed/>
@@ -2130,11 +2130,11 @@
       <w:color w:val="2F5496" w:themeColor="accent1" w:themeShade="BF"/>
     </w:rPr>
   </w:style>
-  <w:style w:type="paragraph" w:styleId="Heading6">
+  <w:style w:type="paragraph" w:styleId="u6">
     <w:name w:val="heading 6"/>
-    <w:basedOn w:val="Normal"/>
-    <w:next w:val="Normal"/>
-    <w:link w:val="Heading6Char"/>
+    <w:basedOn w:val="Binhthng"/>
+    <w:next w:val="Binhthng"/>
+    <w:link w:val="u6Char"/>
     <w:uiPriority w:val="9"/>
     <w:semiHidden/>
     <w:unhideWhenUsed/>
@@ -2153,11 +2153,11 @@
       <w:color w:val="595959" w:themeColor="text1" w:themeTint="A6"/>
     </w:rPr>
   </w:style>
-  <w:style w:type="paragraph" w:styleId="Heading7">
+  <w:style w:type="paragraph" w:styleId="u7">
     <w:name w:val="heading 7"/>
-    <w:basedOn w:val="Normal"/>
-    <w:next w:val="Normal"/>
-    <w:link w:val="Heading7Char"/>
+    <w:basedOn w:val="Binhthng"/>
+    <w:next w:val="Binhthng"/>
+    <w:link w:val="u7Char"/>
     <w:uiPriority w:val="9"/>
     <w:semiHidden/>
     <w:unhideWhenUsed/>
@@ -2174,11 +2174,11 @@
       <w:color w:val="595959" w:themeColor="text1" w:themeTint="A6"/>
     </w:rPr>
   </w:style>
-  <w:style w:type="paragraph" w:styleId="Heading8">
+  <w:style w:type="paragraph" w:styleId="u8">
     <w:name w:val="heading 8"/>
-    <w:basedOn w:val="Normal"/>
-    <w:next w:val="Normal"/>
-    <w:link w:val="Heading8Char"/>
+    <w:basedOn w:val="Binhthng"/>
+    <w:next w:val="Binhthng"/>
+    <w:link w:val="u8Char"/>
     <w:uiPriority w:val="9"/>
     <w:semiHidden/>
     <w:unhideWhenUsed/>
@@ -2197,11 +2197,11 @@
       <w:color w:val="272727" w:themeColor="text1" w:themeTint="D8"/>
     </w:rPr>
   </w:style>
-  <w:style w:type="paragraph" w:styleId="Heading9">
+  <w:style w:type="paragraph" w:styleId="u9">
     <w:name w:val="heading 9"/>
-    <w:basedOn w:val="Normal"/>
-    <w:next w:val="Normal"/>
-    <w:link w:val="Heading9Char"/>
+    <w:basedOn w:val="Binhthng"/>
+    <w:next w:val="Binhthng"/>
+    <w:link w:val="u9Char"/>
     <w:uiPriority w:val="9"/>
     <w:semiHidden/>
     <w:unhideWhenUsed/>
@@ -2218,12 +2218,12 @@
       <w:color w:val="272727" w:themeColor="text1" w:themeTint="D8"/>
     </w:rPr>
   </w:style>
-  <w:style w:type="character" w:default="1" w:styleId="DefaultParagraphFont">
+  <w:style w:type="character" w:default="1" w:styleId="Phngmcinhcuaoanvn">
     <w:name w:val="Default Paragraph Font"/>
     <w:uiPriority w:val="1"/>
     <w:unhideWhenUsed/>
   </w:style>
-  <w:style w:type="table" w:default="1" w:styleId="TableNormal">
+  <w:style w:type="table" w:default="1" w:styleId="BangThngthng">
     <w:name w:val="Normal Table"/>
     <w:uiPriority w:val="99"/>
     <w:semiHidden/>
@@ -2238,16 +2238,16 @@
       </w:tblCellMar>
     </w:tblPr>
   </w:style>
-  <w:style w:type="numbering" w:default="1" w:styleId="NoList">
+  <w:style w:type="numbering" w:default="1" w:styleId="Khngco">
     <w:name w:val="No List"/>
     <w:uiPriority w:val="99"/>
     <w:semiHidden/>
     <w:unhideWhenUsed/>
   </w:style>
-  <w:style w:type="character" w:customStyle="1" w:styleId="Heading1Char">
-    <w:name w:val="Heading 1 Char"/>
-    <w:basedOn w:val="DefaultParagraphFont"/>
-    <w:link w:val="Heading1"/>
+  <w:style w:type="character" w:customStyle="1" w:styleId="u1Char">
+    <w:name w:val="Đầu đề 1 Char"/>
+    <w:basedOn w:val="Phngmcinhcuaoanvn"/>
+    <w:link w:val="u1"/>
     <w:uiPriority w:val="9"/>
     <w:rsid w:val="0005227F"/>
     <w:rPr>
@@ -2257,10 +2257,10 @@
       <w:szCs w:val="40"/>
     </w:rPr>
   </w:style>
-  <w:style w:type="character" w:customStyle="1" w:styleId="Heading2Char">
-    <w:name w:val="Heading 2 Char"/>
-    <w:basedOn w:val="DefaultParagraphFont"/>
-    <w:link w:val="Heading2"/>
+  <w:style w:type="character" w:customStyle="1" w:styleId="u2Char">
+    <w:name w:val="Đầu đề 2 Char"/>
+    <w:basedOn w:val="Phngmcinhcuaoanvn"/>
+    <w:link w:val="u2"/>
     <w:uiPriority w:val="9"/>
     <w:semiHidden/>
     <w:rsid w:val="0005227F"/>
@@ -2271,10 +2271,10 @@
       <w:szCs w:val="32"/>
     </w:rPr>
   </w:style>
-  <w:style w:type="character" w:customStyle="1" w:styleId="Heading3Char">
-    <w:name w:val="Heading 3 Char"/>
-    <w:basedOn w:val="DefaultParagraphFont"/>
-    <w:link w:val="Heading3"/>
+  <w:style w:type="character" w:customStyle="1" w:styleId="u3Char">
+    <w:name w:val="Đầu đề 3 Char"/>
+    <w:basedOn w:val="Phngmcinhcuaoanvn"/>
+    <w:link w:val="u3"/>
     <w:uiPriority w:val="9"/>
     <w:semiHidden/>
     <w:rsid w:val="0005227F"/>
@@ -2285,10 +2285,10 @@
       <w:szCs w:val="28"/>
     </w:rPr>
   </w:style>
-  <w:style w:type="character" w:customStyle="1" w:styleId="Heading4Char">
-    <w:name w:val="Heading 4 Char"/>
-    <w:basedOn w:val="DefaultParagraphFont"/>
-    <w:link w:val="Heading4"/>
+  <w:style w:type="character" w:customStyle="1" w:styleId="u4Char">
+    <w:name w:val="Đầu đề 4 Char"/>
+    <w:basedOn w:val="Phngmcinhcuaoanvn"/>
+    <w:link w:val="u4"/>
     <w:uiPriority w:val="9"/>
     <w:semiHidden/>
     <w:rsid w:val="0005227F"/>
@@ -2299,10 +2299,10 @@
       <w:color w:val="2F5496" w:themeColor="accent1" w:themeShade="BF"/>
     </w:rPr>
   </w:style>
-  <w:style w:type="character" w:customStyle="1" w:styleId="Heading5Char">
-    <w:name w:val="Heading 5 Char"/>
-    <w:basedOn w:val="DefaultParagraphFont"/>
-    <w:link w:val="Heading5"/>
+  <w:style w:type="character" w:customStyle="1" w:styleId="u5Char">
+    <w:name w:val="Đầu đề 5 Char"/>
+    <w:basedOn w:val="Phngmcinhcuaoanvn"/>
+    <w:link w:val="u5"/>
     <w:uiPriority w:val="9"/>
     <w:semiHidden/>
     <w:rsid w:val="0005227F"/>
@@ -2311,10 +2311,10 @@
       <w:color w:val="2F5496" w:themeColor="accent1" w:themeShade="BF"/>
     </w:rPr>
   </w:style>
-  <w:style w:type="character" w:customStyle="1" w:styleId="Heading6Char">
-    <w:name w:val="Heading 6 Char"/>
-    <w:basedOn w:val="DefaultParagraphFont"/>
-    <w:link w:val="Heading6"/>
+  <w:style w:type="character" w:customStyle="1" w:styleId="u6Char">
+    <w:name w:val="Đầu đề 6 Char"/>
+    <w:basedOn w:val="Phngmcinhcuaoanvn"/>
+    <w:link w:val="u6"/>
     <w:uiPriority w:val="9"/>
     <w:semiHidden/>
     <w:rsid w:val="0005227F"/>
@@ -2325,10 +2325,10 @@
       <w:color w:val="595959" w:themeColor="text1" w:themeTint="A6"/>
     </w:rPr>
   </w:style>
-  <w:style w:type="character" w:customStyle="1" w:styleId="Heading7Char">
-    <w:name w:val="Heading 7 Char"/>
-    <w:basedOn w:val="DefaultParagraphFont"/>
-    <w:link w:val="Heading7"/>
+  <w:style w:type="character" w:customStyle="1" w:styleId="u7Char">
+    <w:name w:val="Đầu đề 7 Char"/>
+    <w:basedOn w:val="Phngmcinhcuaoanvn"/>
+    <w:link w:val="u7"/>
     <w:uiPriority w:val="9"/>
     <w:semiHidden/>
     <w:rsid w:val="0005227F"/>
@@ -2337,10 +2337,10 @@
       <w:color w:val="595959" w:themeColor="text1" w:themeTint="A6"/>
     </w:rPr>
   </w:style>
-  <w:style w:type="character" w:customStyle="1" w:styleId="Heading8Char">
-    <w:name w:val="Heading 8 Char"/>
-    <w:basedOn w:val="DefaultParagraphFont"/>
-    <w:link w:val="Heading8"/>
+  <w:style w:type="character" w:customStyle="1" w:styleId="u8Char">
+    <w:name w:val="Đầu đề 8 Char"/>
+    <w:basedOn w:val="Phngmcinhcuaoanvn"/>
+    <w:link w:val="u8"/>
     <w:uiPriority w:val="9"/>
     <w:semiHidden/>
     <w:rsid w:val="0005227F"/>
@@ -2351,10 +2351,10 @@
       <w:color w:val="272727" w:themeColor="text1" w:themeTint="D8"/>
     </w:rPr>
   </w:style>
-  <w:style w:type="character" w:customStyle="1" w:styleId="Heading9Char">
-    <w:name w:val="Heading 9 Char"/>
-    <w:basedOn w:val="DefaultParagraphFont"/>
-    <w:link w:val="Heading9"/>
+  <w:style w:type="character" w:customStyle="1" w:styleId="u9Char">
+    <w:name w:val="Đầu đề 9 Char"/>
+    <w:basedOn w:val="Phngmcinhcuaoanvn"/>
+    <w:link w:val="u9"/>
     <w:uiPriority w:val="9"/>
     <w:semiHidden/>
     <w:rsid w:val="0005227F"/>
@@ -2363,11 +2363,11 @@
       <w:color w:val="272727" w:themeColor="text1" w:themeTint="D8"/>
     </w:rPr>
   </w:style>
-  <w:style w:type="paragraph" w:styleId="Title">
+  <w:style w:type="paragraph" w:styleId="Tiu">
     <w:name w:val="Title"/>
-    <w:basedOn w:val="Normal"/>
-    <w:next w:val="Normal"/>
-    <w:link w:val="TitleChar"/>
+    <w:basedOn w:val="Binhthng"/>
+    <w:next w:val="Binhthng"/>
+    <w:link w:val="TiuChar"/>
     <w:uiPriority w:val="10"/>
     <w:qFormat/>
     <w:rsid w:val="0005227F"/>
@@ -2383,10 +2383,10 @@
       <w:szCs w:val="56"/>
     </w:rPr>
   </w:style>
-  <w:style w:type="character" w:customStyle="1" w:styleId="TitleChar">
-    <w:name w:val="Title Char"/>
-    <w:basedOn w:val="DefaultParagraphFont"/>
-    <w:link w:val="Title"/>
+  <w:style w:type="character" w:customStyle="1" w:styleId="TiuChar">
+    <w:name w:val="Tiêu đề Char"/>
+    <w:basedOn w:val="Phngmcinhcuaoanvn"/>
+    <w:link w:val="Tiu"/>
     <w:uiPriority w:val="10"/>
     <w:rsid w:val="0005227F"/>
     <w:rPr>
@@ -2397,11 +2397,11 @@
       <w:szCs w:val="56"/>
     </w:rPr>
   </w:style>
-  <w:style w:type="paragraph" w:styleId="Subtitle">
+  <w:style w:type="paragraph" w:styleId="Tiuphu">
     <w:name w:val="Subtitle"/>
-    <w:basedOn w:val="Normal"/>
-    <w:next w:val="Normal"/>
-    <w:link w:val="SubtitleChar"/>
+    <w:basedOn w:val="Binhthng"/>
+    <w:next w:val="Binhthng"/>
+    <w:link w:val="TiuphuChar"/>
     <w:uiPriority w:val="11"/>
     <w:qFormat/>
     <w:rsid w:val="0005227F"/>
@@ -2418,10 +2418,10 @@
       <w:szCs w:val="28"/>
     </w:rPr>
   </w:style>
-  <w:style w:type="character" w:customStyle="1" w:styleId="SubtitleChar">
-    <w:name w:val="Subtitle Char"/>
-    <w:basedOn w:val="DefaultParagraphFont"/>
-    <w:link w:val="Subtitle"/>
+  <w:style w:type="character" w:customStyle="1" w:styleId="TiuphuChar">
+    <w:name w:val="Tiêu đề phụ Char"/>
+    <w:basedOn w:val="Phngmcinhcuaoanvn"/>
+    <w:link w:val="Tiuphu"/>
     <w:uiPriority w:val="11"/>
     <w:rsid w:val="0005227F"/>
     <w:rPr>
@@ -2432,11 +2432,11 @@
       <w:szCs w:val="28"/>
     </w:rPr>
   </w:style>
-  <w:style w:type="paragraph" w:styleId="Quote">
+  <w:style w:type="paragraph" w:styleId="Litrichdn">
     <w:name w:val="Quote"/>
-    <w:basedOn w:val="Normal"/>
-    <w:next w:val="Normal"/>
-    <w:link w:val="QuoteChar"/>
+    <w:basedOn w:val="Binhthng"/>
+    <w:next w:val="Binhthng"/>
+    <w:link w:val="LitrichdnChar"/>
     <w:uiPriority w:val="29"/>
     <w:qFormat/>
     <w:rsid w:val="0005227F"/>
@@ -2450,10 +2450,10 @@
       <w:color w:val="404040" w:themeColor="text1" w:themeTint="BF"/>
     </w:rPr>
   </w:style>
-  <w:style w:type="character" w:customStyle="1" w:styleId="QuoteChar">
-    <w:name w:val="Quote Char"/>
-    <w:basedOn w:val="DefaultParagraphFont"/>
-    <w:link w:val="Quote"/>
+  <w:style w:type="character" w:customStyle="1" w:styleId="LitrichdnChar">
+    <w:name w:val="Lời trích dẫn Char"/>
+    <w:basedOn w:val="Phngmcinhcuaoanvn"/>
+    <w:link w:val="Litrichdn"/>
     <w:uiPriority w:val="29"/>
     <w:rsid w:val="0005227F"/>
     <w:rPr>
@@ -2462,9 +2462,9 @@
       <w:color w:val="404040" w:themeColor="text1" w:themeTint="BF"/>
     </w:rPr>
   </w:style>
-  <w:style w:type="paragraph" w:styleId="ListParagraph">
+  <w:style w:type="paragraph" w:styleId="oancuaDanhsach">
     <w:name w:val="List Paragraph"/>
-    <w:basedOn w:val="Normal"/>
+    <w:basedOn w:val="Binhthng"/>
     <w:uiPriority w:val="34"/>
     <w:qFormat/>
     <w:rsid w:val="0005227F"/>
@@ -2473,9 +2473,9 @@
       <w:contextualSpacing/>
     </w:pPr>
   </w:style>
-  <w:style w:type="character" w:styleId="IntenseEmphasis">
+  <w:style w:type="character" w:styleId="NhnmnhThm">
     <w:name w:val="Intense Emphasis"/>
-    <w:basedOn w:val="DefaultParagraphFont"/>
+    <w:basedOn w:val="Phngmcinhcuaoanvn"/>
     <w:uiPriority w:val="21"/>
     <w:qFormat/>
     <w:rsid w:val="0005227F"/>
@@ -2485,11 +2485,11 @@
       <w:color w:val="2F5496" w:themeColor="accent1" w:themeShade="BF"/>
     </w:rPr>
   </w:style>
-  <w:style w:type="paragraph" w:styleId="IntenseQuote">
+  <w:style w:type="paragraph" w:styleId="Nhaykepm">
     <w:name w:val="Intense Quote"/>
-    <w:basedOn w:val="Normal"/>
-    <w:next w:val="Normal"/>
-    <w:link w:val="IntenseQuoteChar"/>
+    <w:basedOn w:val="Binhthng"/>
+    <w:next w:val="Binhthng"/>
+    <w:link w:val="NhaykepmChar"/>
     <w:uiPriority w:val="30"/>
     <w:qFormat/>
     <w:rsid w:val="0005227F"/>
@@ -2508,10 +2508,10 @@
       <w:color w:val="2F5496" w:themeColor="accent1" w:themeShade="BF"/>
     </w:rPr>
   </w:style>
-  <w:style w:type="character" w:customStyle="1" w:styleId="IntenseQuoteChar">
-    <w:name w:val="Intense Quote Char"/>
-    <w:basedOn w:val="DefaultParagraphFont"/>
-    <w:link w:val="IntenseQuote"/>
+  <w:style w:type="character" w:customStyle="1" w:styleId="NhaykepmChar">
+    <w:name w:val="Nháy kép Đậm Char"/>
+    <w:basedOn w:val="Phngmcinhcuaoanvn"/>
+    <w:link w:val="Nhaykepm"/>
     <w:uiPriority w:val="30"/>
     <w:rsid w:val="0005227F"/>
     <w:rPr>
@@ -2520,9 +2520,9 @@
       <w:color w:val="2F5496" w:themeColor="accent1" w:themeShade="BF"/>
     </w:rPr>
   </w:style>
-  <w:style w:type="character" w:styleId="IntenseReference">
+  <w:style w:type="character" w:styleId="ThamchiuNhnmnh">
     <w:name w:val="Intense Reference"/>
-    <w:basedOn w:val="DefaultParagraphFont"/>
+    <w:basedOn w:val="Phngmcinhcuaoanvn"/>
     <w:uiPriority w:val="32"/>
     <w:qFormat/>
     <w:rsid w:val="0005227F"/>
@@ -2534,9 +2534,9 @@
       <w:spacing w:val="5"/>
     </w:rPr>
   </w:style>
-  <w:style w:type="character" w:styleId="Hyperlink">
+  <w:style w:type="character" w:styleId="Siuktni">
     <w:name w:val="Hyperlink"/>
-    <w:basedOn w:val="DefaultParagraphFont"/>
+    <w:basedOn w:val="Phngmcinhcuaoanvn"/>
     <w:uiPriority w:val="99"/>
     <w:unhideWhenUsed/>
     <w:rsid w:val="0005227F"/>
@@ -2545,9 +2545,9 @@
       <w:u w:val="single"/>
     </w:rPr>
   </w:style>
-  <w:style w:type="character" w:styleId="UnresolvedMention">
+  <w:style w:type="character" w:styleId="cpChagiiquyt">
     <w:name w:val="Unresolved Mention"/>
-    <w:basedOn w:val="DefaultParagraphFont"/>
+    <w:basedOn w:val="Phngmcinhcuaoanvn"/>
     <w:uiPriority w:val="99"/>
     <w:semiHidden/>
     <w:unhideWhenUsed/>
@@ -2557,10 +2557,10 @@
       <w:shd w:val="clear" w:color="auto" w:fill="E1DFDD"/>
     </w:rPr>
   </w:style>
-  <w:style w:type="paragraph" w:styleId="HTMLPreformatted">
+  <w:style w:type="paragraph" w:styleId="HTMLinhdangtrc">
     <w:name w:val="HTML Preformatted"/>
-    <w:basedOn w:val="Normal"/>
-    <w:link w:val="HTMLPreformattedChar"/>
+    <w:basedOn w:val="Binhthng"/>
+    <w:link w:val="HTMLinhdangtrcChar"/>
     <w:uiPriority w:val="99"/>
     <w:semiHidden/>
     <w:unhideWhenUsed/>
@@ -2574,10 +2574,10 @@
       <w:szCs w:val="20"/>
     </w:rPr>
   </w:style>
-  <w:style w:type="character" w:customStyle="1" w:styleId="HTMLPreformattedChar">
-    <w:name w:val="HTML Preformatted Char"/>
-    <w:basedOn w:val="DefaultParagraphFont"/>
-    <w:link w:val="HTMLPreformatted"/>
+  <w:style w:type="character" w:customStyle="1" w:styleId="HTMLinhdangtrcChar">
+    <w:name w:val="HTML Định dạng trước Char"/>
+    <w:basedOn w:val="Phngmcinhcuaoanvn"/>
+    <w:link w:val="HTMLinhdangtrc"/>
     <w:uiPriority w:val="99"/>
     <w:semiHidden/>
     <w:rsid w:val="00F00166"/>

</xml_diff>